<commit_message>
docs: update spec doc with latest business decisions
Re-export of LuxMap_Mobile_DacTaChiTiet_v2.2.docx reflecting the mobile A2
role confirmation and other pending edits tracked in CLAUDE.md
</commit_message>
<xml_diff>
--- a/docs/LuxMap_Mobile_DacTaChiTiet_v2.2.docx
+++ b/docs/LuxMap_Mobile_DacTaChiTiet_v2.2.docx
@@ -3601,7 +3601,7 @@
                 <w:sz w:val="20"/>
                 <w:szCs w:val="20"/>
               </w:rPr>
-              <w:t xml:space="preserve">Kết quả kiểm tra kỹ thuật tự động (P5.1): quyền camera, khả năng khoá exposure thật (Camera2), GPS/heading, dung lượng trống so với ước tính video của tuyến (P7), pin</w:t>
+              <w:t xml:space="preserve">Kết quả kiểm tra kỹ thuật tự động (P5.1, C8): quyền camera, khả năng khoá thủ công exposure (ISO/shutter), lấy nét, cân bằng trắng và tắt EIS/HDR/night mode (Camera2), SENSOR_INFO_TIMESTAMP_SOURCE = REALTIME, GPS/heading, dung lượng trống so với ước tính video của tuyến (P7), pin</w:t>
             </w:r>
           </w:p>
           <w:p>
@@ -3886,7 +3886,7 @@
                 <w:sz w:val="20"/>
                 <w:szCs w:val="20"/>
               </w:rPr>
-              <w:t xml:space="preserve">KHÔNG cho vào phiên quay nếu app chưa xác minh exposure đã được khoá thật — yêu cầu phi chức năng bắt buộc (Photometric Comparability); video quay sai chế độ này không thể hiệu chỉnh lại sau khi đã quay. Exposure phải giữ khoá suốt phiên quay (C6)</w:t>
+              <w:t xml:space="preserve">KHÔNG cho vào phiên quay nếu app chưa xác minh exposure đã được khoá thật — yêu cầu phi chức năng bắt buộc (Photometric Comparability); video quay sai chế độ này không thể hiệu chỉnh lại sau khi đã quay. Toàn bộ cấu hình camera (exposure, lấy nét, cân bằng trắng, độ phân giải/fps, tắt EIS/HDR) phải khoá theo profile và giữ suốt phiên quay (C8)</w:t>
             </w:r>
           </w:p>
           <w:p>
@@ -4028,7 +4028,7 @@
                 <w:sz w:val="20"/>
                 <w:szCs w:val="20"/>
               </w:rPr>
-              <w:t xml:space="preserve">Màn hình chính khi lái xe khảo sát: quay video liên tục, đồng thời ghi vị trí GPS và giá trị lux từ cảm biến ánh sáng qua BLE, mỗi bản ghi kèm thời điểm. Mobile chỉ ghi, đóng gói và gửi đi — không cắt frame, không xử lý video trên máy (C6/C7, cập nhật 2026-09-27).</w:t>
+              <w:t xml:space="preserve">Màn hình chính khi lái xe khảo sát: quay video liên tục, đồng thời ghi GPS track và giá trị lux từ module cảm biến qua BLE, tất cả gắn chung đồng hồ của điện thoại. Mobile chỉ ghi, đóng gói và gửi đi — không cắt frame, không xử lý video trên máy (C6/C7/C8, cập nhật 2026-09-27).</w:t>
             </w:r>
           </w:p>
         </w:tc>
@@ -4148,19 +4148,19 @@
                 <w:sz w:val="20"/>
                 <w:szCs w:val="20"/>
               </w:rPr>
-              <w:t xml:space="preserve">khối kết nối cảm biến ánh sáng qua Bluetooth (BLE): trạng thái chưa kết nối / đang kết nối / đã kết nối và giá trị lux đang nhận để xác nhận cảm biến hoạt động</w:t>
-            </w:r>
-          </w:p>
-          <w:p>
-            <w:pPr>
-              <w:spacing w:after="60"/>
-            </w:pPr>
-            <w:r>
-              <w:rPr>
-                <w:sz w:val="20"/>
-                <w:szCs w:val="20"/>
-              </w:rPr>
-              <w:t xml:space="preserve">Nút "Bắt đầu quay" chỉ bật khi đã xác nhận kết nối BLE thành công (và exposure đã khoá — F03)</w:t>
+              <w:t xml:space="preserve">khối kết nối module cảm biến ánh sáng qua Bluetooth (BLE): trạng thái chưa kết nối / đang kết nối / đã kết nối và giá trị lux đang nhận để xác nhận cảm biến hoạt động</w:t>
+            </w:r>
+          </w:p>
+          <w:p>
+            <w:pPr>
+              <w:spacing w:after="60"/>
+            </w:pPr>
+            <w:r>
+              <w:rPr>
+                <w:sz w:val="20"/>
+                <w:szCs w:val="20"/>
+              </w:rPr>
+              <w:t xml:space="preserve">Nút "Bắt đầu quay" chỉ bật khi đã xác nhận kết nối BLE thành công và cấu hình camera đã khoá đúng profile (F03, C8)</w:t>
             </w:r>
           </w:p>
           <w:p>
@@ -4193,7 +4193,7 @@
                 <w:sz w:val="20"/>
                 <w:szCs w:val="20"/>
               </w:rPr>
-              <w:t xml:space="preserve">Chỉ báo GPS: độ chính xác (mét), heading; chỉ báo cảm biến BLE: trạng thái kết nối và giá trị lux gần nhất; icon khoá exposure; quãng đường đã đi</w:t>
+              <w:t xml:space="preserve">Chỉ báo GPS: độ chính xác (mét), heading; chỉ báo cảm biến BLE: trạng thái kết nối và giá trị lux gần nhất; icon khoá cấu hình camera; quãng đường đã đi</w:t>
             </w:r>
           </w:p>
           <w:p>
@@ -4269,7 +4269,7 @@
                 <w:sz w:val="20"/>
                 <w:szCs w:val="20"/>
               </w:rPr>
-              <w:t xml:space="preserve">mở app, kết nối cảm biến ánh sáng qua Bluetooth. Chỉ khi xác nhận kết nối thành công mới cho phép bắt đầu.</w:t>
+              <w:t xml:space="preserve">mở app, kết nối module cảm biến ánh sáng qua Bluetooth. Chỉ khi xác nhận kết nối thành công mới cho phép bắt đầu.</w:t>
             </w:r>
           </w:p>
           <w:p>
@@ -4290,19 +4290,19 @@
                 <w:sz w:val="20"/>
                 <w:szCs w:val="20"/>
               </w:rPr>
-              <w:t xml:space="preserve">ba việc chạy song song. Quay video: camera ghi hình liên tục trong suốt phiên. Ghi vị trí (GPS): điện thoại tự động cập nhật toạ độ hiện tại theo khoảng thời gian đều đặn (ví dụ mỗi giây). Nhận dữ liệu cảm biến: cảm biến gửi liên tục giá trị lux theo thời gian thực qua BLE.</w:t>
-            </w:r>
-          </w:p>
-          <w:p>
-            <w:pPr>
-              <w:spacing w:after="60"/>
-            </w:pPr>
-            <w:r>
-              <w:rPr>
-                <w:sz w:val="20"/>
-                <w:szCs w:val="20"/>
-              </w:rPr>
-              <w:t xml:space="preserve">Luồng lux: cảm biến đo lux → gửi giá trị lux (không kèm giờ) qua BLE → app nhận được → app lấy giờ hiện tại của điện thoại → gán giờ đó vào giá trị lux → ghi vào log.</w:t>
+              <w:t xml:space="preserve">app ghi cặp mốc (giờ UTC, elapsedRealtimeNanos) và cấu hình camera thực tế vào file cấu hình quay, rồi chạy song song ba việc. Quay video: camera ghi hình liên tục với cấu hình đã khoá (C8). Ghi vị trí (GPS): điện thoại tự động cập nhật toạ độ theo khoảng thời gian đều đặn (ví dụ mỗi giây). Nhận dữ liệu cảm biến: module gửi liên tục giá trị lux qua BLE notify (8–20 mẫu/giây).</w:t>
+            </w:r>
+          </w:p>
+          <w:p>
+            <w:pPr>
+              <w:spacing w:after="60"/>
+            </w:pPr>
+            <w:r>
+              <w:rPr>
+                <w:sz w:val="20"/>
+                <w:szCs w:val="20"/>
+              </w:rPr>
+              <w:t xml:space="preserve">Luồng lux: module đo lux → gửi gói (seq, module_ms, lux — không kèm giờ thật) qua BLE → app nhận được → app gắn elapsedRealtimeNanos của điện thoại lúc nhận → ghi vào log lux.</w:t>
             </w:r>
           </w:p>
           <w:p>
@@ -4323,7 +4323,7 @@
                 <w:sz w:val="20"/>
                 <w:szCs w:val="20"/>
               </w:rPr>
-              <w:t xml:space="preserve">cả ba việc tiếp diễn liên tục, độc lập với nhau — camera vẫn quay, GPS vẫn cập nhật, cảm biến vẫn gửi lux. Mỗi khi có một mẩu dữ liệu mới (một điểm GPS, một giá trị lux), app ghi lại kèm thời điểm chính xác lúc đó vào một bản ghi chung.</w:t>
+              <w:t xml:space="preserve">cả ba việc tiếp diễn liên tục, độc lập với nhau. Mỗi mẩu dữ liệu mới (một điểm GPS, một giá trị lux, một frame video) được ghi kèm thời điểm theo cùng đồng hồ elapsedRealtimeNanos.</w:t>
             </w:r>
           </w:p>
           <w:p>
@@ -4344,7 +4344,7 @@
                 <w:sz w:val="20"/>
                 <w:szCs w:val="20"/>
               </w:rPr>
-              <w:t xml:space="preserve">người khảo sát bấm "Dừng quay". Video được lưu thành 1 file hoàn chỉnh. Toàn bộ lịch sử vị trí + lịch sử giá trị lux (mỗi bản ghi đều có thời điểm) được lưu thành 1 file log riêng.</w:t>
+              <w:t xml:space="preserve">người khảo sát bấm "Dừng quay". Video được lưu thành 1 file hoàn chỉnh; log lux, GPS track và log timestamp frame được lưu thành các file log riêng, cùng file cấu hình quay (C8).</w:t>
             </w:r>
           </w:p>
           <w:p>
@@ -4365,7 +4365,7 @@
                 <w:sz w:val="20"/>
                 <w:szCs w:val="20"/>
               </w:rPr>
-              <w:t xml:space="preserve">app gộp video + file log (vị trí + lux theo thời gian) thành 1 bộ dữ liệu và gửi lên hệ thống BE (qua F06/hàng đợi đồng bộ F13 khi có mạng).</w:t>
+              <w:t xml:space="preserve">app gộp video + các file log + file cấu hình quay thành 1 bộ dữ liệu và gửi lên hệ thống BE (qua F06/hàng đợi đồng bộ F13 khi có mạng).</w:t>
             </w:r>
           </w:p>
         </w:tc>
@@ -4432,31 +4432,31 @@
                 <w:sz w:val="20"/>
                 <w:szCs w:val="20"/>
               </w:rPr>
-              <w:t xml:space="preserve">Đầu ra mỗi phiên: 1 file video + 1 file log gồm các bản ghi vị trí GPS (thời điểm, toạ độ, kèm heading theo C6) và các bản ghi lux (thời điểm = giờ điện thoại lúc app nhận, giá trị lux)</w:t>
-            </w:r>
-          </w:p>
-          <w:p>
-            <w:pPr>
-              <w:spacing w:after="60"/>
-            </w:pPr>
-            <w:r>
-              <w:rPr>
-                <w:sz w:val="20"/>
-                <w:szCs w:val="20"/>
-              </w:rPr>
-              <w:t xml:space="preserve">Bước 4 gửi 1 bộ dữ liệu (video + file log) lên BE; server cắt frame từ video và khớp với track GPS theo thời điểm (C6)</w:t>
-            </w:r>
-          </w:p>
-          <w:p>
-            <w:pPr>
-              <w:spacing w:after="60"/>
-            </w:pPr>
-            <w:r>
-              <w:rPr>
-                <w:sz w:val="20"/>
-                <w:szCs w:val="20"/>
-              </w:rPr>
-              <w:t xml:space="preserve">Chưa có tên bảng Room, định dạng/tên field của file log hay endpoint upload chính thức — không tự đặt tên khi code, chờ WP2/WP5 (C7). Bảng local_survey_frame và survey.survey_frame (SurveyFrame chụp ảnh rời) không còn dùng cho F04</w:t>
+              <w:t xml:space="preserve">Đầu ra mỗi phiên (C8 mục 4): video; log lux (seq, module_ms, phone_elapsed_ns, lux); GPS track (elapsedRealtimeNanos, toạ độ, heading, độ chính xác); log timestamp frame video; file cấu hình quay</w:t>
+            </w:r>
+          </w:p>
+          <w:p>
+            <w:pPr>
+              <w:spacing w:after="60"/>
+            </w:pPr>
+            <w:r>
+              <w:rPr>
+                <w:sz w:val="20"/>
+                <w:szCs w:val="20"/>
+              </w:rPr>
+              <w:t xml:space="preserve">Server cắt frame từ video, khớp frame với GPS track và log lux theo cùng đồng hồ, so cấu hình quay với profile đã chốt (thay cho kiểm tra metadata JPEG ở BE-16)</w:t>
+            </w:r>
+          </w:p>
+          <w:p>
+            <w:pPr>
+              <w:spacing w:after="60"/>
+            </w:pPr>
+            <w:r>
+              <w:rPr>
+                <w:sz w:val="20"/>
+                <w:szCs w:val="20"/>
+              </w:rPr>
+              <w:t xml:space="preserve">Chưa có tên bảng Room, định dạng file hay endpoint upload chính thức — không tự đặt tên khi code, chờ WP2/WP5 (C7/C8). Bảng local_survey_frame và survey.survey_frame (SurveyFrame chụp ảnh rời) không còn dùng cho F04</w:t>
             </w:r>
           </w:p>
         </w:tc>
@@ -4523,7 +4523,7 @@
                 <w:sz w:val="20"/>
                 <w:szCs w:val="20"/>
               </w:rPr>
-              <w:t xml:space="preserve">Chặn cứng: không cho bắt đầu quay khi chưa xác nhận kết nối cảm biến lux BLE (C7) hoặc exposure chưa được khoá (F03); exposure giữ khoá suốt phiên quay</w:t>
+              <w:t xml:space="preserve">Chặn cứng: không cho bắt đầu quay khi chưa xác nhận kết nối cảm biến lux BLE (C7) hoặc cấu hình camera chưa khoá đúng profile (F03, C8); cấu hình giữ nguyên suốt phiên quay</w:t>
             </w:r>
           </w:p>
           <w:p>
@@ -4547,7 +4547,7 @@
                 <w:sz w:val="20"/>
                 <w:szCs w:val="20"/>
               </w:rPr>
-              <w:t xml:space="preserve">Mọi bản ghi GPS và lux dùng cùng đồng hồ của điện thoại để server khớp được với video</w:t>
+              <w:t xml:space="preserve">Mọi dấu thời gian dùng SystemClock.elapsedRealtimeNanos() — không dùng giờ hệ thống (có thể nhảy khi đồng bộ giờ mạng)</w:t>
             </w:r>
           </w:p>
           <w:p>
@@ -4571,7 +4571,7 @@
                 <w:sz w:val="20"/>
                 <w:szCs w:val="20"/>
               </w:rPr>
-              <w:t xml:space="preserve">Cảnh báo rõ nếu cảm biến BLE mất kết nối giữa phiên; hành vi sau đó (tiếp tục quay và đánh dấu khoảng trống lux, hay dừng phiên) chưa chốt — xem các điểm còn mở trước Phần D</w:t>
+              <w:t xml:space="preserve">Cảnh báo rõ nếu module BLE mất kết nối giữa phiên; hành vi sau đó (tiếp tục quay hay dừng phiên) chưa chốt — xem các điểm còn mở trước Phần D. Gói bị mất được server phát hiện qua seq</w:t>
             </w:r>
           </w:p>
           <w:p>
@@ -5614,7 +5614,7 @@
                 <w:sz w:val="20"/>
                 <w:szCs w:val="20"/>
               </w:rPr>
-              <w:t xml:space="preserve">CẬP NHẬT (2026-09-25 / 2026-09-27): endpoint POST /api/v1/survey-sweeps/{id}/frames và thanh tiến độ "theo từng khung hình" ở trên thuộc mô hình chụp ảnh rời — theo C6/C7, mỗi phiên upload 1 file video + 1 file log (track GPS/heading/timestamp + lux BLE), tiến độ tính theo byte, upload theo chunk/resume như P5.2. Lưu ý "nén ảnh chỉ ở bước tải lên" cũng cần chốt lại cho video (có nén/transcode hay upload bản gốc) cùng WP4. Chưa có endpoint chính thức — không tự đặt tên khi code, xem C6/C7 và chờ WP2/WP5.</w:t>
+              <w:t xml:space="preserve">CẬP NHẬT (2026-09-25 / 2026-09-27): endpoint POST /api/v1/survey-sweeps/{id}/frames và thanh tiến độ "theo từng khung hình" ở trên thuộc mô hình chụp ảnh rời — theo C6/C7, mỗi phiên upload 1 gói gồm video, log lux, GPS track, log timestamp frame và file cấu hình quay (C8), dự kiến qua MinIO, tiến độ tính theo byte, upload theo chunk/resume như P5.2. Lưu ý "nén ảnh chỉ ở bước tải lên" cũng cần chốt lại cho video (có nén/transcode hay upload bản gốc) cùng WP4. Chưa có endpoint chính thức — không tự đặt tên khi code, xem C6/C7 và chờ WP2/WP5.</w:t>
             </w:r>
           </w:p>
         </w:tc>
@@ -8662,7 +8662,7 @@
                 <w:sz w:val="20"/>
                 <w:szCs w:val="20"/>
               </w:rPr>
-              <w:t xml:space="preserve">CẬP NHẬT (2026-09-25 / 2026-09-27): danh sách mục chờ đồng bộ ở trên chưa có các loại mục mới theo C6/C7: gói dữ liệu phiên khảo sát (1 file video + 1 file log GPS/heading/lux), kết quả Field Engineer sửa phân loại AI (override kèm lý do), báo cáo kiểm tra (Inspection Task) và bằng chứng sửa chữa (Repair Task). Gói video là mục dung lượng lớn nhất — cần hiển thị tiến độ theo byte và tuân theo cài đặt chỉ tải qua Wifi ở F06. Chưa có tên loại thực thể/endpoint chính thức — xem C6/C7.</w:t>
+              <w:t xml:space="preserve">CẬP NHẬT (2026-09-25 / 2026-09-27): danh sách mục chờ đồng bộ ở trên chưa có các loại mục mới theo C6/C7: gói dữ liệu phiên khảo sát (video + các file log + file cấu hình quay — C8), kết quả Field Engineer sửa phân loại AI (override kèm lý do), báo cáo kiểm tra (Inspection Task) và bằng chứng sửa chữa (Repair Task). Gói video là mục dung lượng lớn nhất — cần hiển thị tiến độ theo byte và tuân theo cài đặt chỉ tải qua Wifi ở F06. Chưa có tên loại thực thể/endpoint chính thức — xem C6/C7.</w:t>
             </w:r>
           </w:p>
         </w:tc>
@@ -12853,7 +12853,7 @@
         <w:spacing w:after="100"/>
       </w:pPr>
       <w:r>
-        <w:t>Không cho bắt đầu quay khảo sát nếu chưa khoá exposure (kiểm tra ở F03) hoặc chưa xác nhận kết nối cảm biến lux BLE (Bước 0 ở F04): chặn cứng chứ không chỉ nhắc nhở.</w:t>
+        <w:t>Không cho bắt đầu quay khảo sát nếu chưa khoá exposure và cấu hình camera theo profile (kiểm tra ở F03, C8) hoặc chưa xác nhận kết nối cảm biến lux BLE (Bước 0 ở F04): chặn cứng chứ không chỉ nhắc nhở.</w:t>
       </w:r>
     </w:p>
     <w:p>
@@ -13137,12 +13137,26 @@
           <w:i/>
           <w:iCs/>
         </w:rPr>
-        <w:t>Chưa có tên bảng Room, tên field log lux/GPS, hay endpoint upload chính thức cho luồng này — không tự đặt tên khi code F03/F04. Cần xác nhận với WP2/WP5 cách BE tiếp nhận và lưu file log này (cùng lúc với video + track GPS ở C6) trước khi code; xem thêm CLAUDE.md của repo mobile. Luồng này đã được đưa vào F04 (Bước 0–4); tuyến khảo sát do Kỹ sư bảo trì phân công (F03).</w:t>
+        <w:t>Chưa có tên bảng Room, tên field log lux/GPS, hay endpoint upload chính thức cho luồng này — không tự đặt tên khi code F03/F04. Cần xác nhận với WP2/WP5 cách BE tiếp nhận và lưu file log này (cùng lúc với video + track GPS ở C6) trước khi code; xem thêm CLAUDE.md của repo mobile. Luồng này đã được đưa vào F04 (Bước 0–4); tuyến khảo sát do Kỹ sư bảo trì phân công (F03). Chi tiết kỹ thuật (gói BLE, đồng hồ chung, khoá cấu hình camera, các file đầu ra) xem C8.</w:t>
       </w:r>
     </w:p>
     <w:p>
       <w:r>
         <w:br w:type="page"/>
+      </w:r>
+    </w:p>
+    <w:p>
+      <w:pPr>
+        <w:pStyle w:val="Heading2"/>
+        <w:spacing w:before="300" w:after="150"/>
+      </w:pPr>
+      <w:r>
+        <w:rPr>
+          <w:b/>
+          <w:bCs/>
+          <w:color w:val="1E3A5F"/>
+        </w:rPr>
+        <w:t xml:space="preserve">C8. Quyết định kỹ thuật phiên quay khảo sát (2026-09-27) — module lux BLE, đồng hồ chung, khoá cấu hình camera</w:t>
       </w:r>
     </w:p>
     <w:p>
@@ -13154,7 +13168,478 @@
           <w:i/>
           <w:iCs/>
         </w:rPr>
-        <w:t xml:space="preserve">CẬP NHẬT 2026-09-27 — CÁC ĐIỂM CÒN MỞ SAU C6/C7 (cần chốt với chủ dự án và WP2/WP5 trước khi code các phần liên quan):</w:t>
+        <w:t xml:space="preserve">Đã thống nhất trong nhóm (2026-09-27). Mục này chi tiết hoá cách thực hiện luồng ở C7/F04; nếu C7, F04 hoặc P5 mô tả khác với mục này thì áp dụng C8. Tên file, định dạng file và endpoint chính thức vẫn phải chốt cùng WP2/WP5 trước khi code.</w:t>
+      </w:r>
+    </w:p>
+    <w:p>
+      <w:pPr>
+        <w:spacing w:after="100"/>
+      </w:pPr>
+      <w:r>
+        <w:rPr>
+          <w:b/>
+          <w:bCs/>
+        </w:rPr>
+        <w:t xml:space="preserve">1. Module cảm biến lux và gói BLE</w:t>
+      </w:r>
+    </w:p>
+    <w:p>
+      <w:pPr>
+        <w:pStyle w:val="ListParagraph"/>
+        <w:numPr>
+          <w:ilvl w:val="0"/>
+          <w:numId w:val="2"/>
+        </w:numPr>
+        <w:spacing w:after="100"/>
+      </w:pPr>
+      <w:r>
+        <w:t xml:space="preserve">Module ESP32 + cảm biến BH1750 gửi từng mẫu đo sang điện thoại bằng BLE notify, khoảng 8–20 mẫu/giây; mỗi gói chỉ vài byte nên BLE xử lý nhẹ.</w:t>
+      </w:r>
+    </w:p>
+    <w:p>
+      <w:pPr>
+        <w:pStyle w:val="ListParagraph"/>
+        <w:numPr>
+          <w:ilvl w:val="0"/>
+          <w:numId w:val="2"/>
+        </w:numPr>
+        <w:spacing w:after="100"/>
+      </w:pPr>
+      <w:r>
+        <w:rPr>
+          <w:b/>
+          <w:bCs/>
+        </w:rPr>
+        <w:t xml:space="preserve">Mỗi gói gồm: </w:t>
+      </w:r>
+      <w:r>
+        <w:t xml:space="preserve">seq (số thứ tự tăng dần, để phát hiện gói bị mất), module_ms (đồng hồ nội của module) và lux.</w:t>
+      </w:r>
+    </w:p>
+    <w:p>
+      <w:pPr>
+        <w:pStyle w:val="ListParagraph"/>
+        <w:numPr>
+          <w:ilvl w:val="0"/>
+          <w:numId w:val="2"/>
+        </w:numPr>
+        <w:spacing w:after="100"/>
+      </w:pPr>
+      <w:r>
+        <w:t xml:space="preserve">Khi nhận gói, app tự gắn timestamp của điện thoại và ghi vào log lux thô — người dùng không nhập gì.</w:t>
+      </w:r>
+    </w:p>
+    <w:p>
+      <w:pPr>
+        <w:pStyle w:val="ListParagraph"/>
+        <w:numPr>
+          <w:ilvl w:val="0"/>
+          <w:numId w:val="2"/>
+        </w:numPr>
+        <w:spacing w:after="100"/>
+      </w:pPr>
+      <w:r>
+        <w:rPr>
+          <w:b/>
+          <w:bCs/>
+        </w:rPr>
+        <w:t xml:space="preserve">Mất gói: </w:t>
+      </w:r>
+      <w:r>
+        <w:t xml:space="preserve">server thấy chỗ hổng qua seq. Nếu xe đi ngang một cột đúng lúc hổng dữ liệu thì cột đó ghi unknown — không nội suy, không đoán.</w:t>
+      </w:r>
+    </w:p>
+    <w:p>
+      <w:pPr>
+        <w:pStyle w:val="ListParagraph"/>
+        <w:numPr>
+          <w:ilvl w:val="0"/>
+          <w:numId w:val="2"/>
+        </w:numPr>
+        <w:spacing w:after="100"/>
+      </w:pPr>
+      <w:r>
+        <w:rPr>
+          <w:b/>
+          <w:bCs/>
+        </w:rPr>
+        <w:t xml:space="preserve">Cần chốt bằng đo thử: </w:t>
+      </w:r>
+      <w:r>
+        <w:t xml:space="preserve">ở chế độ độ phân giải cao, BH1750 cần khoảng 120 ms cho mỗi lần đo (≈8 mẫu/giây); muốn gần 20 mẫu/giây phải dùng chế độ phân giải thấp (bước 4 lux), có thể quá thô với đèn đường ban đêm.</w:t>
+      </w:r>
+    </w:p>
+    <w:p>
+      <w:pPr>
+        <w:spacing w:after="100"/>
+      </w:pPr>
+      <w:r>
+        <w:rPr>
+          <w:b/>
+          <w:bCs/>
+        </w:rPr>
+        <w:t xml:space="preserve">2. Đồng hồ chung cho video, GPS và lux</w:t>
+      </w:r>
+    </w:p>
+    <w:p>
+      <w:pPr>
+        <w:pStyle w:val="ListParagraph"/>
+        <w:numPr>
+          <w:ilvl w:val="0"/>
+          <w:numId w:val="2"/>
+        </w:numPr>
+        <w:spacing w:after="100"/>
+      </w:pPr>
+      <w:r>
+        <w:t xml:space="preserve">Cả ba luồng dùng SystemClock.elapsedRealtimeNanos() của điện thoại — đồng hồ đơn điệu, không nhảy khi máy đồng bộ giờ mạng. GPS lấy Location.getElapsedRealtimeNanos(); lux gắn elapsedRealtimeNanos lúc nhận gói BLE; video dùng SENSOR_TIMESTAMP của Camera2.</w:t>
+      </w:r>
+    </w:p>
+    <w:p>
+      <w:pPr>
+        <w:pStyle w:val="ListParagraph"/>
+        <w:numPr>
+          <w:ilvl w:val="0"/>
+          <w:numId w:val="2"/>
+        </w:numPr>
+        <w:spacing w:after="100"/>
+      </w:pPr>
+      <w:r>
+        <w:t xml:space="preserve">SENSOR_TIMESTAMP chỉ cùng hệ thời gian với elapsedRealtime khi SENSOR_INFO_TIMESTAMP_SOURCE = REALTIME — F03 phải kiểm tra giá trị này trên máy quay thật. Khi đúng, server biết chính xác mẫu lux nào ứng với frame nào, không cần bước bật flash để đồng bộ.</w:t>
+      </w:r>
+    </w:p>
+    <w:p>
+      <w:pPr>
+        <w:pStyle w:val="ListParagraph"/>
+        <w:numPr>
+          <w:ilvl w:val="0"/>
+          <w:numId w:val="2"/>
+        </w:numPr>
+        <w:spacing w:after="100"/>
+      </w:pPr>
+      <w:r>
+        <w:rPr>
+          <w:b/>
+          <w:bCs/>
+        </w:rPr>
+        <w:t xml:space="preserve">Log timestamp frame (bổ sung so với đề xuất gốc): </w:t>
+      </w:r>
+      <w:r>
+        <w:t xml:space="preserve">file video (MP4) không tự lưu SENSOR_TIMESTAMP của từng frame, nên app phải ghi thêm log timestamp frame (tối thiểu frame đầu tiên, khuyến nghị mọi frame) để server quy đổi thời gian trong video sang elapsedRealtime.</w:t>
+      </w:r>
+    </w:p>
+    <w:p>
+      <w:pPr>
+        <w:pStyle w:val="ListParagraph"/>
+        <w:numPr>
+          <w:ilvl w:val="0"/>
+          <w:numId w:val="2"/>
+        </w:numPr>
+        <w:spacing w:after="100"/>
+      </w:pPr>
+      <w:r>
+        <w:rPr>
+          <w:b/>
+          <w:bCs/>
+        </w:rPr>
+        <w:t xml:space="preserve">Quy đổi UTC một lần mỗi phiên: </w:t>
+      </w:r>
+      <w:r>
+        <w:t xml:space="preserve">lúc bắt đầu phiên, app ghi một cặp mốc (giờ UTC của điện thoại, elapsedRealtimeNanos) vào file cấu hình quay.</w:t>
+      </w:r>
+    </w:p>
+    <w:p>
+      <w:pPr>
+        <w:pStyle w:val="ListParagraph"/>
+        <w:numPr>
+          <w:ilvl w:val="0"/>
+          <w:numId w:val="2"/>
+        </w:numPr>
+        <w:spacing w:after="100"/>
+      </w:pPr>
+      <w:r>
+        <w:rPr>
+          <w:b/>
+          <w:bCs/>
+        </w:rPr>
+        <w:t xml:space="preserve">Độ trễ BLE: </w:t>
+      </w:r>
+      <w:r>
+        <w:t xml:space="preserve">timestamp lúc nhận bị trễ và dao động khoảng 10–50 ms; ở 30 km/h, 50 ms ≈ 0,4 m — nhỏ hơn nhiều so với sai số GPS (3–10 m) và khoảng cách giữa hai cột (25–40 m). Server dùng cặp (module_ms, phone_elapsed_ns) của cả phiên để khớp một đường thẳng, loại bỏ phần dao động.</w:t>
+      </w:r>
+    </w:p>
+    <w:p>
+      <w:pPr>
+        <w:spacing w:after="100"/>
+      </w:pPr>
+      <w:r>
+        <w:rPr>
+          <w:b/>
+          <w:bCs/>
+        </w:rPr>
+        <w:t xml:space="preserve">3. Khoá cấu hình camera</w:t>
+      </w:r>
+    </w:p>
+    <w:p>
+      <w:pPr>
+        <w:pStyle w:val="ListParagraph"/>
+        <w:numPr>
+          <w:ilvl w:val="0"/>
+          <w:numId w:val="2"/>
+        </w:numPr>
+        <w:spacing w:after="100"/>
+      </w:pPr>
+      <w:r>
+        <w:t xml:space="preserve">Dùng Camera2 (hoặc CameraX + Camera2Interop) để khoá toàn bộ thông số dưới đây trong suốt phiên quay.</w:t>
+      </w:r>
+    </w:p>
+    <w:p>
+      <w:pPr>
+        <w:pStyle w:val="ListParagraph"/>
+        <w:numPr>
+          <w:ilvl w:val="0"/>
+          <w:numId w:val="2"/>
+        </w:numPr>
+        <w:spacing w:after="100"/>
+      </w:pPr>
+      <w:r>
+        <w:rPr>
+          <w:b/>
+          <w:bCs/>
+        </w:rPr>
+        <w:t xml:space="preserve">Phơi sáng: </w:t>
+      </w:r>
+      <w:r>
+        <w:t xml:space="preserve">tắt AE, cố định ISO và shutter. Shutter càng nhanh càng ít nhoè nhưng ảnh tối hơn — chốt con số bằng một buổi quay thử.</w:t>
+      </w:r>
+    </w:p>
+    <w:p>
+      <w:pPr>
+        <w:pStyle w:val="ListParagraph"/>
+        <w:numPr>
+          <w:ilvl w:val="0"/>
+          <w:numId w:val="2"/>
+        </w:numPr>
+        <w:spacing w:after="100"/>
+      </w:pPr>
+      <w:r>
+        <w:rPr>
+          <w:b/>
+          <w:bCs/>
+        </w:rPr>
+        <w:t xml:space="preserve">Lấy nét: </w:t>
+      </w:r>
+      <w:r>
+        <w:t xml:space="preserve">tắt AF, cố định ở vô cực.</w:t>
+      </w:r>
+    </w:p>
+    <w:p>
+      <w:pPr>
+        <w:pStyle w:val="ListParagraph"/>
+        <w:numPr>
+          <w:ilvl w:val="0"/>
+          <w:numId w:val="2"/>
+        </w:numPr>
+        <w:spacing w:after="100"/>
+      </w:pPr>
+      <w:r>
+        <w:rPr>
+          <w:b/>
+          <w:bCs/>
+        </w:rPr>
+        <w:t xml:space="preserve">Cân bằng trắng: </w:t>
+      </w:r>
+      <w:r>
+        <w:t xml:space="preserve">tắt AWB, cố định.</w:t>
+      </w:r>
+    </w:p>
+    <w:p>
+      <w:pPr>
+        <w:pStyle w:val="ListParagraph"/>
+        <w:numPr>
+          <w:ilvl w:val="0"/>
+          <w:numId w:val="2"/>
+        </w:numPr>
+        <w:spacing w:after="100"/>
+      </w:pPr>
+      <w:r>
+        <w:rPr>
+          <w:b/>
+          <w:bCs/>
+        </w:rPr>
+        <w:t xml:space="preserve">Độ phân giải và fps: </w:t>
+      </w:r>
+      <w:r>
+        <w:t xml:space="preserve">cố định, ví dụ 1080p30.</w:t>
+      </w:r>
+    </w:p>
+    <w:p>
+      <w:pPr>
+        <w:pStyle w:val="ListParagraph"/>
+        <w:numPr>
+          <w:ilvl w:val="0"/>
+          <w:numId w:val="2"/>
+        </w:numPr>
+        <w:spacing w:after="100"/>
+      </w:pPr>
+      <w:r>
+        <w:rPr>
+          <w:b/>
+          <w:bCs/>
+        </w:rPr>
+        <w:t xml:space="preserve">Chống rung (EIS), HDR, night mode: </w:t>
+      </w:r>
+      <w:r>
+        <w:t xml:space="preserve">tắt hết — các chế độ này crop, bóp méo hoặc ghép frame, làm lệch vị trí và độ sáng.</w:t>
+      </w:r>
+    </w:p>
+    <w:p>
+      <w:pPr>
+        <w:pStyle w:val="ListParagraph"/>
+        <w:numPr>
+          <w:ilvl w:val="0"/>
+          <w:numId w:val="2"/>
+        </w:numPr>
+        <w:spacing w:after="100"/>
+      </w:pPr>
+      <w:r>
+        <w:t xml:space="preserve">App ghi toàn bộ cấu hình thực tế vào file cấu hình quay; server so với một profile đã chốt và từ chối phiên nếu lệch. Việc này thay cho kiểm tra metadata từng ảnh JPEG ở BE-16.</w:t>
+      </w:r>
+    </w:p>
+    <w:p>
+      <w:pPr>
+        <w:spacing w:after="100"/>
+      </w:pPr>
+      <w:r>
+        <w:rPr>
+          <w:b/>
+          <w:bCs/>
+        </w:rPr>
+        <w:t xml:space="preserve">4. Đầu ra mỗi phiên khảo sát (app tự sinh, người dùng không nhập)</w:t>
+      </w:r>
+    </w:p>
+    <w:p>
+      <w:pPr>
+        <w:pStyle w:val="ListParagraph"/>
+        <w:numPr>
+          <w:ilvl w:val="0"/>
+          <w:numId w:val="2"/>
+        </w:numPr>
+        <w:spacing w:after="100"/>
+      </w:pPr>
+      <w:r>
+        <w:rPr>
+          <w:b/>
+          <w:bCs/>
+        </w:rPr>
+        <w:t xml:space="preserve">Video: </w:t>
+      </w:r>
+      <w:r>
+        <w:t xml:space="preserve">1 file cho cả phiên.</w:t>
+      </w:r>
+    </w:p>
+    <w:p>
+      <w:pPr>
+        <w:pStyle w:val="ListParagraph"/>
+        <w:numPr>
+          <w:ilvl w:val="0"/>
+          <w:numId w:val="2"/>
+        </w:numPr>
+        <w:spacing w:after="100"/>
+      </w:pPr>
+      <w:r>
+        <w:rPr>
+          <w:b/>
+          <w:bCs/>
+        </w:rPr>
+        <w:t xml:space="preserve">Log lux: </w:t>
+      </w:r>
+      <w:r>
+        <w:t xml:space="preserve">seq, module_ms, phone_elapsed_ns, lux.</w:t>
+      </w:r>
+    </w:p>
+    <w:p>
+      <w:pPr>
+        <w:pStyle w:val="ListParagraph"/>
+        <w:numPr>
+          <w:ilvl w:val="0"/>
+          <w:numId w:val="2"/>
+        </w:numPr>
+        <w:spacing w:after="100"/>
+      </w:pPr>
+      <w:r>
+        <w:rPr>
+          <w:b/>
+          <w:bCs/>
+        </w:rPr>
+        <w:t xml:space="preserve">GPS track: </w:t>
+      </w:r>
+      <w:r>
+        <w:t xml:space="preserve">mỗi điểm gồm elapsedRealtimeNanos, toạ độ, heading, độ chính xác.</w:t>
+      </w:r>
+    </w:p>
+    <w:p>
+      <w:pPr>
+        <w:pStyle w:val="ListParagraph"/>
+        <w:numPr>
+          <w:ilvl w:val="0"/>
+          <w:numId w:val="2"/>
+        </w:numPr>
+        <w:spacing w:after="100"/>
+      </w:pPr>
+      <w:r>
+        <w:rPr>
+          <w:b/>
+          <w:bCs/>
+        </w:rPr>
+        <w:t xml:space="preserve">Log timestamp frame video: </w:t>
+      </w:r>
+      <w:r>
+        <w:t xml:space="preserve">xem mục 2.</w:t>
+      </w:r>
+    </w:p>
+    <w:p>
+      <w:pPr>
+        <w:pStyle w:val="ListParagraph"/>
+        <w:numPr>
+          <w:ilvl w:val="0"/>
+          <w:numId w:val="2"/>
+        </w:numPr>
+        <w:spacing w:after="100"/>
+      </w:pPr>
+      <w:r>
+        <w:rPr>
+          <w:b/>
+          <w:bCs/>
+        </w:rPr>
+        <w:t xml:space="preserve">File cấu hình quay: </w:t>
+      </w:r>
+      <w:r>
+        <w:t xml:space="preserve">cấu hình camera thực tế, thông tin thiết bị (manufacturer, model, camera_id, focal_length, SENSOR_INFO_TIMESTAMP_SOURCE), mã module cảm biến, cặp mốc UTC ↔ elapsedRealtime.</w:t>
+      </w:r>
+    </w:p>
+    <w:p>
+      <w:pPr>
+        <w:pStyle w:val="ListParagraph"/>
+        <w:numPr>
+          <w:ilvl w:val="0"/>
+          <w:numId w:val="2"/>
+        </w:numPr>
+        <w:spacing w:after="100"/>
+      </w:pPr>
+      <w:r>
+        <w:t xml:space="preserve">Toàn bộ xử lý (cắt frame, khớp thời gian, gắn cột, phân loại) làm ở server. Upload video dung lượng lớn dự kiến qua MinIO — chờ quyết định riêng (contract-drift.md, D-R21/D-R24) và WP2/WP5.</w:t>
+      </w:r>
+    </w:p>
+    <w:p>
+      <w:pPr>
+        <w:spacing w:after="160"/>
+      </w:pPr>
+      <w:r>
+        <w:rPr>
+          <w:i/>
+          <w:iCs/>
+        </w:rPr>
+        <w:t xml:space="preserve">CẬP NHẬT 2026-09-27 — CÁC ĐIỂM CÒN MỞ SAU C6/C7/C8 (cần chốt với chủ dự án và WP2/WP5 trước khi code các phần liên quan):</w:t>
       </w:r>
     </w:p>
     <w:p>
@@ -13226,7 +13711,43 @@
           <w:i/>
           <w:iCs/>
         </w:rPr>
-        <w:t xml:space="preserve">(6) Nguồn thời gian chung: C7 gán thời gian điện thoại cho từng giá trị lux; cần chốt video, track GPS và log lux dùng cùng một nguồn đồng hồ để server khớp chính xác (P10 đã có kiểm thử "đồng hồ thiết bị sai").</w:t>
+        <w:t xml:space="preserve">(6) ĐÃ CHỐT (2026-09-27, xem C8): video, GPS và lux dùng chung SystemClock.elapsedRealtimeNanos() của điện thoại; quy đổi sang UTC một lần mỗi phiên.</w:t>
+      </w:r>
+    </w:p>
+    <w:p>
+      <w:pPr>
+        <w:spacing w:after="160"/>
+      </w:pPr>
+      <w:r>
+        <w:rPr>
+          <w:i/>
+          <w:iCs/>
+        </w:rPr>
+        <w:t xml:space="preserve">(7) Đề xuất C8 ghi "phải có app quay riêng (Member 4)" — cần làm rõ đây là một app tách khỏi app LuxMap, hay là module quay nằm trong F04; tài liệu này đang giả định F04 nằm trong app mobile chính.</w:t>
+      </w:r>
+    </w:p>
+    <w:p>
+      <w:pPr>
+        <w:spacing w:after="160"/>
+      </w:pPr>
+      <w:r>
+        <w:rPr>
+          <w:i/>
+          <w:iCs/>
+        </w:rPr>
+        <w:t xml:space="preserve">(8) Máy có SENSOR_INFO_TIMESTAMP_SOURCE khác REALTIME: loại khỏi danh sách thiết bị hỗ trợ (P5.1) hay cần phương án đồng bộ dự phòng (ví dụ bật flash).</w:t>
+      </w:r>
+    </w:p>
+    <w:p>
+      <w:pPr>
+        <w:spacing w:after="160"/>
+      </w:pPr>
+      <w:r>
+        <w:rPr>
+          <w:i/>
+          <w:iCs/>
+        </w:rPr>
+        <w:t xml:space="preserve">(9) Tần số lấy mẫu và chế độ đo của BH1750 (8 hay 20 mẫu/giây, phân giải cao hay thấp), giá trị ISO/shutter của profile camera — chốt bằng buổi quay/đo thử.</w:t>
       </w:r>
     </w:p>
     <w:p>
@@ -13263,7 +13784,7 @@
         <w:spacing w:after="160"/>
       </w:pPr>
       <w:r>
-        <w:t>Kỹ sư bảo trì lập và phân công tuyến khảo sát trên Web GIS → Field Engineer nhận tuyến, chạy kiểm tra chuẩn bị (F03 — FM-09) → Kết nối cảm biến lux BLE, bắt đầu phiên: quay video + ghi GPS + ghi lux song song, offline (F04 — FM-08, FM-10) → Dừng quay: lưu 1 file video + 1 file log vị trí/lux → Kiểm tra trước khi nộp (F05 — FM-11, nội dung kiểm tra chưa chốt) → Đóng gói video + file log, gửi lên BE, resume nếu mất mạng (F06 — FM-12, FM-13) → Server cắt frame từ video, khớp với track GPS theo thời điểm và chạy pipeline AI phân loại normal/dim/out (WP4 CV-Analytics) → Field Engineer xem kết quả AI, sửa phân loại nếu cần kèm lý do (màn hình chưa gán — xem các điểm còn mở trước Phần D) → Gửi Manager duyệt (cổng duyệt #1) → Manager giao Inspection Task (xem D2).</w:t>
+        <w:t>Kỹ sư bảo trì lập và phân công tuyến khảo sát trên Web GIS → Field Engineer nhận tuyến, chạy kiểm tra chuẩn bị (F03 — FM-09) → Kết nối cảm biến lux BLE, bắt đầu phiên: quay video + ghi GPS + ghi lux song song, offline (F04 — FM-08, FM-10) → Dừng quay: lưu video, log lux, GPS track, log timestamp frame và file cấu hình quay (C8) → Kiểm tra trước khi nộp (F05 — FM-11, nội dung kiểm tra chưa chốt) → Đóng gói các file của phiên, gửi lên BE, resume nếu mất mạng (F06 — FM-12, FM-13) → Server cắt frame từ video, khớp với track GPS theo thời điểm và chạy pipeline AI phân loại normal/dim/out (WP4 CV-Analytics) → Field Engineer xem kết quả AI, sửa phân loại nếu cần kèm lý do (màn hình chưa gán — xem các điểm còn mở trước Phần D) → Gửi Manager duyệt (cổng duyệt #1) → Manager giao Inspection Task (xem D2).</w:t>
       </w:r>
     </w:p>
     <w:p>
@@ -14073,7 +14594,7 @@
           <w:i/>
           <w:iCs/>
         </w:rPr>
-        <w:t xml:space="preserve">CẬP NHẬT 2026-09-27: C6 (chốt 2026-09-25) và C7 (chốt 2026-09-27) được quyết định SAU P5–P9. Ở những điểm P5–P9 còn mô tả chụp ảnh rời theo khung hình (P5.1 metadata theo frame, P5.3 tự động chụp theo quãng đường, danh sách bảng ở P6, ước tính dung lượng theo ảnh ở P7), áp dụng C6/C7; các nội dung khác của P5–P9 vẫn giữ nguyên hiệu lực.</w:t>
+        <w:t xml:space="preserve">CẬP NHẬT 2026-09-27: C6 (chốt 2026-09-25), C7 và C8 (chốt 2026-09-27) được quyết định SAU P5–P9. Ở những điểm P5–P9 còn mô tả chụp ảnh rời theo khung hình (P5.1 metadata theo frame, P5.3 tự động chụp theo quãng đường, danh sách bảng ở P6, ước tính dung lượng theo ảnh ở P7), áp dụng C6/C7/C8; các nội dung khác của P5–P9 vẫn giữ nguyên hiệu lực.</w:t>
       </w:r>
     </w:p>
     <w:p>
@@ -14241,7 +14762,7 @@
           <w:i/>
           <w:iCs/>
         </w:rPr>
-        <w:t xml:space="preserve">CẬP NHẬT (2026-09-25 / 2026-09-27): theo C6, P5.1–P5.3 cần hiểu lại cho phiên quay video: khoá exposure phải giữ ổn định suốt phiên quay, không chỉ 1 lần chụp; metadata thiết bị (manufacturer, model, camera_id, focal_length, capability profile) nhiều khả năng gắn theo phiên quay/file video thay vì từng frame — cần xác nhận với WP4; "tự động chụp theo quãng đường", chống double-trigger và cờ invalid_for_association theo frame không còn áp dụng trên mobile vì mobile không cắt frame — GPS/heading ghi thành track liên tục theo thời gian. Ngưỡng độ chính xác GPS ở P5.3 vẫn áp dụng cho track. Chưa có tên field chính thức — xem C6/C7.</w:t>
+        <w:t xml:space="preserve">CẬP NHẬT (2026-09-25 / 2026-09-27): theo C6, P5.1–P5.3 cần hiểu lại cho phiên quay video: khoá exposure (cùng lấy nét, cân bằng trắng cố định và tắt EIS/HDR — C8) phải giữ ổn định suốt phiên quay, không chỉ 1 lần chụp; metadata thiết bị (manufacturer, model, camera_id, focal_length, capability profile) ghi vào file cấu hình quay của phiên (C8) thay vì từng frame; "tự động chụp theo quãng đường", chống double-trigger và cờ invalid_for_association theo frame không còn áp dụng trên mobile vì mobile không cắt frame — GPS/heading ghi thành track liên tục theo thời gian. Ngưỡng độ chính xác GPS ở P5.3 vẫn áp dụng cho track. Chưa có tên field chính thức — xem C6/C7.</w:t>
       </w:r>
     </w:p>
     <w:p>
@@ -15434,7 +15955,7 @@
               <w:rPr>
                 <w:sz w:val="18"/>
               </w:rPr>
-              <w:t>Chưa có tuyến được giao; cached/stale; permission; exposure; GPS; storage; battery</w:t>
+              <w:t>Chưa có tuyến được giao; cached/stale; permission; exposure/camera profile; timestamp source; GPS; storage; battery</w:t>
             </w:r>
           </w:p>
         </w:tc>
@@ -15487,7 +16008,7 @@
               <w:rPr>
                 <w:sz w:val="18"/>
               </w:rPr>
-              <w:t>BLE chưa kết nối / mất kết nối; recording; GPS weak/lost; storage low; đang đóng gói</w:t>
+              <w:t>BLE chưa kết nối / mất kết nối; camera config lệch profile; recording; GPS weak/lost; storage low; đang đóng gói</w:t>
             </w:r>
           </w:p>
         </w:tc>
@@ -16125,7 +16646,7 @@
           <w:i/>
           <w:iCs/>
         </w:rPr>
-        <w:t xml:space="preserve">CẬP NHẬT 2026-09-27: bổ sung kiểm thử cho C6/C7: cảm biến BLE chưa kết nối (phải chặn Bắt đầu quay), quyền Bluetooth bị từ chối, BLE mất kết nối giữa phiên rồi kết nối lại; lệch thời gian giữa video, track GPS và log lux; upload file video lớn bị ngắt và resume; exposure giữ ổn định suốt phiên quay dài; Field Engineer sửa phân loại AI — kiểm tra ai_classified không bị ghi đè và audit trail đủ người sửa, thời điểm, giá trị cũ/mới.</w:t>
+        <w:t xml:space="preserve">CẬP NHẬT 2026-09-27: bổ sung kiểm thử cho C6/C7: cảm biến BLE chưa kết nối (phải chặn Bắt đầu quay), quyền Bluetooth bị từ chối, BLE mất kết nối giữa phiên rồi kết nối lại; lệch thời gian giữa video, track GPS và log lux; upload file video lớn bị ngắt và resume; exposure giữ ổn định suốt phiên quay dài; Field Engineer sửa phân loại AI — kiểm tra ai_classified không bị ghi đè và audit trail đủ người sửa, thời điểm, giá trị cũ/mới; gói BLE bị mất (hổng seq) và cột đi ngang lúc hổng được ghi unknown; máy có SENSOR_INFO_TIMESTAMP_SOURCE khác REALTIME; cấu hình camera lệch profile bị server từ chối; khớp log timestamp frame với video.</w:t>
       </w:r>
     </w:p>
     <w:sectPr>

</xml_diff>

<commit_message>
docs: add C8.5 naming authority for survey session Room schema
Grants WP6 (mobile) authority to name local Room tables directly and
draft the session package file contract, instead of blocking on WP2/WP5
for every new name — only the server-side endpoint and field names
still need Backend sign-off.
</commit_message>
<xml_diff>
--- a/docs/LuxMap_Mobile_DacTaChiTiet_v2.2.docx
+++ b/docs/LuxMap_Mobile_DacTaChiTiet_v2.2.docx
@@ -2301,7 +2301,7 @@
         <w:spacing w:after="160"/>
       </w:pPr>
       <w:r>
-        <w:t>Mỗi màn hình được mô tả theo sáu mục cố định. Tên thực thể trong cột "API / Bảng dữ liệu" dùng đúng tên đã xuất hiện trong sheet Backend của bảng công việc (SurveySweep, SurveyFrame, Pole, Fixture, WorkOrder, Fault...); những thực thể chưa có tên chính thức từ Backend (ví dụ các bảng cho file video/log ở F04) được đánh dấu rõ là đề xuất cần chốt cùng WP2.</w:t>
+        <w:t>Mỗi màn hình được mô tả theo sáu mục cố định. Tên thực thể trong cột "API / Bảng dữ liệu" dùng đúng tên đã xuất hiện trong sheet Backend của bảng công việc (SurveySweep, SurveyFrame, Pole, Fixture, WorkOrder, Fault...); những thực thể chưa có tên chính thức từ Backend (ví dụ endpoint upload gói phiên ở F06) được đánh dấu rõ là đề xuất cần chốt cùng WP2. Tên bảng Room và định dạng file gói phiên không thuộc nhóm này — xem C8 mục 5.</w:t>
       </w:r>
     </w:p>
     <w:p>
@@ -4456,7 +4456,7 @@
                 <w:sz w:val="20"/>
                 <w:szCs w:val="20"/>
               </w:rPr>
-              <w:t xml:space="preserve">Chưa có tên bảng Room, định dạng file hay endpoint upload chính thức — không tự đặt tên khi code, chờ WP2/WP5 (C7/C8). Bảng local_survey_frame và survey.survey_frame (SurveyFrame chụp ảnh rời) không còn dùng cho F04</w:t>
+              <w:t xml:space="preserve">Tên bảng Room do WP6 đặt; định dạng các file trong gói phiên theo hợp đồng "Session package" do mobile soạn, WP4 duyệt; endpoint upload do Backend (WP2/WP5) quyết — xem C8 mục 5. Bảng local_survey_frame và survey.survey_frame (SurveyFrame chụp ảnh rời) không còn dùng cho F04</w:t>
             </w:r>
           </w:p>
         </w:tc>
@@ -5614,7 +5614,7 @@
                 <w:sz w:val="20"/>
                 <w:szCs w:val="20"/>
               </w:rPr>
-              <w:t xml:space="preserve">CẬP NHẬT (2026-09-25 / 2026-09-27): endpoint POST /api/v1/survey-sweeps/{id}/frames và thanh tiến độ "theo từng khung hình" ở trên thuộc mô hình chụp ảnh rời — theo C6/C7, mỗi phiên upload 1 gói gồm video, log lux, GPS track, log timestamp frame và file cấu hình quay (C8), dự kiến qua MinIO, tiến độ tính theo byte, upload theo chunk/resume như P5.2. Lưu ý "nén ảnh chỉ ở bước tải lên" cũng cần chốt lại cho video (có nén/transcode hay upload bản gốc) cùng WP4. Chưa có endpoint chính thức — không tự đặt tên khi code, xem C6/C7 và chờ WP2/WP5.</w:t>
+              <w:t xml:space="preserve">CẬP NHẬT (2026-09-25 / 2026-09-27): endpoint POST /api/v1/survey-sweeps/{id}/frames và thanh tiến độ "theo từng khung hình" ở trên thuộc mô hình chụp ảnh rời — theo C6/C7, mỗi phiên upload 1 gói gồm video, log lux, GPS track, log timestamp frame và file cấu hình quay (C8), dự kiến qua MinIO, tiến độ tính theo byte, upload theo chunk/resume như P5.2. Lưu ý "nén ảnh chỉ ở bước tải lên" cũng cần chốt lại cho video (có nén/transcode hay upload bản gốc) cùng WP4. Endpoint upload và cách dùng MinIO do Backend (WP2/WP5) quyết; trong lúc chờ, mobile code upload qua một interface (ví dụ UploadRepository) và kiểm thử chunk/resume bằng server giả lập — xem C8 mục 5.</w:t>
             </w:r>
           </w:p>
         </w:tc>
@@ -8662,7 +8662,7 @@
                 <w:sz w:val="20"/>
                 <w:szCs w:val="20"/>
               </w:rPr>
-              <w:t xml:space="preserve">CẬP NHẬT (2026-09-25 / 2026-09-27): danh sách mục chờ đồng bộ ở trên chưa có các loại mục mới theo C6/C7: gói dữ liệu phiên khảo sát (video + các file log + file cấu hình quay — C8), kết quả Field Engineer sửa phân loại AI (override kèm lý do), báo cáo kiểm tra (Inspection Task) và bằng chứng sửa chữa (Repair Task). Gói video là mục dung lượng lớn nhất — cần hiển thị tiến độ theo byte và tuân theo cài đặt chỉ tải qua Wifi ở F06. Chưa có tên loại thực thể/endpoint chính thức — xem C6/C7.</w:t>
+              <w:t xml:space="preserve">CẬP NHẬT (2026-09-25 / 2026-09-27): danh sách mục chờ đồng bộ ở trên chưa có các loại mục mới theo C6/C7: gói dữ liệu phiên khảo sát (video + các file log + file cấu hình quay — C8), kết quả Field Engineer sửa phân loại AI (override kèm lý do), báo cáo kiểm tra (Inspection Task) và bằng chứng sửa chữa (Repair Task). Gói video là mục dung lượng lớn nhất — cần hiển thị tiến độ theo byte và tuân theo cài đặt chỉ tải qua Wifi ở F06. Tên loại mục trong sync_queue do WP6 đặt; endpoint tương ứng do Backend quyết — xem C8 mục 5.</w:t>
             </w:r>
           </w:p>
         </w:tc>
@@ -11052,7 +11052,7 @@
           <w:i/>
           <w:iCs/>
         </w:rPr>
-        <w:t>CẬP NHẬT (2026-09-25 / 2026-09-27): local_survey_frame ở trên mô tả lưu từng khung hình chụp rời — theo C6, khảo sát chuyển sang quay video liên tục kèm track GPS/heading/timestamp, và theo C7 còn thêm log lux liên tục qua BLE gán timestamp trên điện thoại; mobile không cắt frame, chỉ upload video + file log. Danh sách bảng cục bộ ở trên chưa có bảng cho video/track GPS-heading/log lux, cũng chưa có bảng cho kết quả phân loại AI (ai_classified) tách khỏi final_classified/override. Chưa có tên bảng/field chính thức cho các mục này — không tự đặt tên khi code, xem C6/C7 và chờ WP2/WP5.</w:t>
+        <w:t>CẬP NHẬT (2026-09-25 / 2026-09-27): local_survey_frame ở trên mô tả lưu từng khung hình chụp rời — theo C6, khảo sát chuyển sang quay video liên tục kèm track GPS/heading/timestamp, và theo C7 còn thêm log lux liên tục qua BLE gán timestamp trên điện thoại; mobile không cắt frame, chỉ upload video + file log. Danh sách bảng cục bộ ở trên chưa có bảng cho video/track GPS-heading/log lux, cũng chưa có bảng cho kết quả phân loại AI (ai_classified) tách khỏi final_classified/override. Tên bảng Room cho các mục này do WP6 đặt (C8 mục 5); riêng tên field phía server (ví dụ ai_classified, final_classified/override) và payload đồng bộ vẫn chờ WP2/WP5.</w:t>
       </w:r>
     </w:p>
     <w:p>
@@ -11456,7 +11456,7 @@
                 <w:sz w:val="19"/>
                 <w:szCs w:val="19"/>
               </w:rPr>
-              <w:t>file video + file log (chưa có tên bảng — C7)</w:t>
+              <w:t>gói phiên: video + các file log (Room do WP6 đặt — C8)</w:t>
             </w:r>
           </w:p>
         </w:tc>
@@ -12186,7 +12186,7 @@
           <w:i/>
           <w:iCs/>
         </w:rPr>
-        <w:t>CẬP NHẬT (2026-09-25 / 2026-09-27): dòng F03/F04 trong bảng trên đã cập nhật theo luồng mới (tuyến do Kỹ sư bảo trì phân công; F04 ghi video + file log GPS/lux). Các dòng F05, F06 vẫn ánh xạ theo mô hình chụp ảnh rời (local_survey_frame, /frames) và F08, F09, F10 vẫn theo 1 WorkOrder liền mạch — theo C6/C7, F05/F06 thao tác trên gói video + file log, F08–F10 thao tác trên Inspection Task/Repair Task. Chưa có endpoint/bảng chính thức thay thế — không tự đặt tên khi code, xem C6/C7 và chờ WP2/WP5.</w:t>
+        <w:t>CẬP NHẬT (2026-09-25 / 2026-09-27): dòng F03/F04 trong bảng trên đã cập nhật theo luồng mới (tuyến do Kỹ sư bảo trì phân công; F04 ghi video + file log GPS/lux). Các dòng F05, F06 vẫn ánh xạ theo mô hình chụp ảnh rời (local_survey_frame, /frames) và F08, F09, F10 vẫn theo 1 WorkOrder liền mạch — theo C6/C7, F05/F06 thao tác trên gói video + file log, F08–F10 thao tác trên Inspection Task/Repair Task. Endpoint và bảng phía server thay thế do Backend (WP2/WP5) quyết; bảng Room do WP6 đặt, định dạng file gói phiên do mobile soạn và WP4 duyệt (C8 mục 5).</w:t>
       </w:r>
     </w:p>
     <w:p>
@@ -13051,7 +13051,7 @@
           <w:i/>
           <w:iCs/>
         </w:rPr>
-        <w:t>Chưa có tên bảng/field/endpoint chính thức cho các thay đổi trên. Trước khi code lại F03/F04/F08–F10 hoặc phần xử lý kết quả phân loại AI trong survey, xác nhận với WP2/WP5 và cập nhật lại các mục C4/F08–F10 ở trên cho khớp; xem thêm ghi chú tương ứng trong CLAUDE.md của repo mobile, mục "Quyết định nghiệp vụ mới đã chốt (2026-09-25)".</w:t>
+        <w:t>Chưa có tên bảng/field/endpoint chính thức phía server cho các thay đổi trên (bảng Room phía mobile do WP6 đặt — C8 mục 5). Trước khi code lại F08–F10 hoặc phần xử lý kết quả phân loại AI trong survey, xác nhận với WP2/WP5 và cập nhật lại các mục C4/F08–F10 ở trên cho khớp; xem thêm ghi chú tương ứng trong CLAUDE.md của repo mobile, mục "Quyết định nghiệp vụ mới đã chốt (2026-09-25)".</w:t>
       </w:r>
     </w:p>
     <w:p>
@@ -13137,7 +13137,7 @@
           <w:i/>
           <w:iCs/>
         </w:rPr>
-        <w:t>Chưa có tên bảng Room, tên field log lux/GPS, hay endpoint upload chính thức cho luồng này — không tự đặt tên khi code F03/F04. Cần xác nhận với WP2/WP5 cách BE tiếp nhận và lưu file log này (cùng lúc với video + track GPS ở C6) trước khi code; xem thêm CLAUDE.md của repo mobile. Luồng này đã được đưa vào F04 (Bước 0–4); tuyến khảo sát do Kỹ sư bảo trì phân công (F03). Chi tiết kỹ thuật (gói BLE, đồng hồ chung, khoá cấu hình camera, các file đầu ra) xem C8.</w:t>
+        <w:t>Phân quyền đặt tên cho luồng này theo C8 mục 5: bảng Room do WP6 đặt; tên field và định dạng file log lux/GPS do mobile soạn, WP4 duyệt; endpoint upload và cách BE lưu gói dữ liệu do Backend (WP2/WP5) quyết; xem thêm CLAUDE.md của repo mobile. Luồng này đã được đưa vào F04 (Bước 0–4); tuyến khảo sát do Kỹ sư bảo trì phân công (F03). Chi tiết kỹ thuật (gói BLE, đồng hồ chung, khoá cấu hình camera, các file đầu ra) xem C8.</w:t>
       </w:r>
     </w:p>
     <w:p>
@@ -13168,7 +13168,7 @@
           <w:i/>
           <w:iCs/>
         </w:rPr>
-        <w:t xml:space="preserve">Đã thống nhất trong nhóm (2026-09-27). Mục này chi tiết hoá cách thực hiện luồng ở C7/F04; nếu C7, F04 hoặc P5 mô tả khác với mục này thì áp dụng C8. Tên file, định dạng file và endpoint chính thức vẫn phải chốt cùng WP2/WP5 trước khi code.</w:t>
+        <w:t xml:space="preserve">Đã thống nhất trong nhóm (2026-09-27). Mục này chi tiết hoá cách thực hiện luồng ở C7/F04; nếu C7, F04 hoặc P5 mô tả khác với mục này thì áp dụng C8. Ai đặt tên và chốt định dạng cho từng phần: xem mục 5.</w:t>
       </w:r>
     </w:p>
     <w:p>
@@ -13627,7 +13627,119 @@
         <w:spacing w:after="100"/>
       </w:pPr>
       <w:r>
-        <w:t xml:space="preserve">Toàn bộ xử lý (cắt frame, khớp thời gian, gắn cột, phân loại) làm ở server. Upload video dung lượng lớn dự kiến qua MinIO — chờ quyết định riêng (contract-drift.md, D-R21/D-R24) và WP2/WP5.</w:t>
+        <w:t xml:space="preserve">Toàn bộ xử lý (cắt frame, khớp thời gian, gắn cột, phân loại) làm ở server. Upload video dung lượng lớn dự kiến qua MinIO — do Backend quyết (contract-drift.md, D-R21/D-R24), xem mục 5.</w:t>
+      </w:r>
+    </w:p>
+    <w:p>
+      <w:pPr>
+        <w:spacing w:after="100"/>
+      </w:pPr>
+      <w:r>
+        <w:rPr>
+          <w:b/>
+          <w:bCs/>
+        </w:rPr>
+        <w:t xml:space="preserve">5. Phân quyền đặt tên và hợp đồng dữ liệu (cập nhật 2026-09-28)</w:t>
+      </w:r>
+    </w:p>
+    <w:p>
+      <w:pPr>
+        <w:pStyle w:val="ListParagraph"/>
+        <w:numPr>
+          <w:ilvl w:val="0"/>
+          <w:numId w:val="2"/>
+        </w:numPr>
+        <w:spacing w:after="100"/>
+      </w:pPr>
+      <w:r>
+        <w:rPr>
+          <w:b/>
+          <w:bCs/>
+        </w:rPr>
+        <w:t xml:space="preserve">Bảng Room (CSDL cục bộ): </w:t>
+      </w:r>
+      <w:r>
+        <w:t xml:space="preserve">WP6 tự đặt tên và thiết kế. Room là kho lưu nội bộ của app, server không đọc trực tiếp; chỉ payload gửi lên và định dạng file mới cần thống nhất với bên khác. Không cần chờ WP2/WP5 để code phần ghi cục bộ của F04.</w:t>
+      </w:r>
+    </w:p>
+    <w:p>
+      <w:pPr>
+        <w:pStyle w:val="ListParagraph"/>
+        <w:numPr>
+          <w:ilvl w:val="0"/>
+          <w:numId w:val="2"/>
+        </w:numPr>
+        <w:spacing w:after="100"/>
+      </w:pPr>
+      <w:r>
+        <w:rPr>
+          <w:b/>
+          <w:bCs/>
+        </w:rPr>
+        <w:t xml:space="preserve">Định dạng các file trong gói phiên (log lux, GPS track, log timestamp frame, file cấu hình quay): </w:t>
+      </w:r>
+      <w:r>
+        <w:t xml:space="preserve">mobile là bên tạo ra nên mobile soạn hợp đồng "Session package" (bản đầu là v0), gửi WP4 duyệt và WP2 góp ý phần lưu trữ. Gói có một file manifest liệt kê các file, checksum, schema_version, session_id và mã tuyến; mọi file log mang schema_version để đổi định dạng sau này không làm hỏng dữ liệu đã quay.</w:t>
+      </w:r>
+    </w:p>
+    <w:p>
+      <w:pPr>
+        <w:pStyle w:val="ListParagraph"/>
+        <w:numPr>
+          <w:ilvl w:val="0"/>
+          <w:numId w:val="2"/>
+        </w:numPr>
+        <w:spacing w:after="100"/>
+      </w:pPr>
+      <w:r>
+        <w:rPr>
+          <w:b/>
+          <w:bCs/>
+        </w:rPr>
+        <w:t xml:space="preserve">Endpoint upload, cách lưu gói trên server và MinIO: </w:t>
+      </w:r>
+      <w:r>
+        <w:t xml:space="preserve">do Backend (WP2/WP5) quyết. Trong lúc chờ, mobile code upload qua một interface (ví dụ UploadRepository) và kiểm thử chunk/resume bằng server giả lập; khi endpoint được chốt chỉ thay phần cài đặt thật.</w:t>
+      </w:r>
+    </w:p>
+    <w:p>
+      <w:pPr>
+        <w:pStyle w:val="ListParagraph"/>
+        <w:numPr>
+          <w:ilvl w:val="0"/>
+          <w:numId w:val="2"/>
+        </w:numPr>
+        <w:spacing w:after="100"/>
+      </w:pPr>
+      <w:r>
+        <w:rPr>
+          <w:b/>
+          <w:bCs/>
+        </w:rPr>
+        <w:t xml:space="preserve">Theo dõi: </w:t>
+      </w:r>
+      <w:r>
+        <w:t xml:space="preserve">mọi tên tạm và mọi chỗ lệch giữa bản nháp với quyết định cuối được ghi vào contract-drift.md.</w:t>
+      </w:r>
+    </w:p>
+    <w:p>
+      <w:pPr>
+        <w:pStyle w:val="ListParagraph"/>
+        <w:numPr>
+          <w:ilvl w:val="0"/>
+          <w:numId w:val="2"/>
+        </w:numPr>
+        <w:spacing w:after="100"/>
+      </w:pPr>
+      <w:r>
+        <w:rPr>
+          <w:b/>
+          <w:bCs/>
+        </w:rPr>
+        <w:t xml:space="preserve">Thứ tự triển khai: </w:t>
+      </w:r>
+      <w:r>
+        <w:t xml:space="preserve">(1) F04 — khoá cấu hình camera, GPS track, BLE, ghi file, Room; (2) song song gửi bản nháp Session package v0 cho WP4/WP2; (3) F06 viết trên interface và kiểm thử bằng server giả lập; (4) nối endpoint thật khi Backend chốt.</w:t>
       </w:r>
     </w:p>
     <w:p>
@@ -15132,7 +15244,7 @@
           <w:i/>
           <w:iCs/>
         </w:rPr>
-        <w:t xml:space="preserve">CẬP NHẬT (2026-09-25 / 2026-09-27): bảng trên chưa đầy đủ. Còn thiếu các bảng đã nêu ở C2 (local_survey_sweep, local_work_order, local_work_order_evidence, local_fault_report, local_notification) và các bảng mới theo C6/C7: phiên quay video, track GPS/heading/timestamp, log lux BLE, kết quả phân loại AI (ai_classified tách khỏi final_classified/override kèm audit trail), Inspection Task/Repair Task. Chưa có tên bảng chính thức cho các bảng mới — không tự đặt tên khi code, chờ WP2/WP5.</w:t>
+        <w:t xml:space="preserve">CẬP NHẬT (2026-09-25 / 2026-09-27): bảng trên chưa đầy đủ. Còn thiếu các bảng đã nêu ở C2 (local_survey_sweep, local_work_order, local_work_order_evidence, local_fault_report, local_notification) và các bảng mới theo C6/C7: phiên quay video, track GPS/heading/timestamp, log lux BLE, kết quả phân loại AI (ai_classified tách khỏi final_classified/override kèm audit trail), Inspection Task/Repair Task. Tên các bảng Room mới do WP6 đặt và bổ sung vào bảng này (C8 mục 5); tên field phía server cho kết quả AI và Inspection Task/Repair Task vẫn chờ WP2/WP5.</w:t>
       </w:r>
     </w:p>
     <w:p>

</xml_diff>